<commit_message>
Deploy tailored job application and resume.pdf for 종합물류_그래이박스
</commit_message>
<xml_diff>
--- a/data/outputs/graybox_김승률_지원서.docx
+++ b/data/outputs/graybox_김승률_지원서.docx
@@ -561,6 +561,66 @@
               <w:rPr>
                 <w:sz w:val="18"/>
               </w:rPr>
+              <w:t>2019.03 ~ 2019.08</w:t>
+            </w:r>
+          </w:p>
+        </w:tc>
+        <w:tc>
+          <w:tcPr>
+            <w:tcW w:type="dxa" w:w="2664"/>
+          </w:tcPr>
+          <w:p>
+            <w:r>
+              <w:rPr>
+                <w:sz w:val="18"/>
+              </w:rPr>
+              <w:t>(주)원창엔지니어링</w:t>
+            </w:r>
+          </w:p>
+        </w:tc>
+        <w:tc>
+          <w:tcPr>
+            <w:tcW w:type="dxa" w:w="2664"/>
+          </w:tcPr>
+          <w:p>
+            <w:pPr>
+              <w:jc w:val="center"/>
+            </w:pPr>
+            <w:r>
+              <w:rPr>
+                <w:sz w:val="18"/>
+              </w:rPr>
+              <w:t>직장가입자</w:t>
+            </w:r>
+          </w:p>
+        </w:tc>
+        <w:tc>
+          <w:tcPr>
+            <w:tcW w:type="dxa" w:w="2664"/>
+          </w:tcPr>
+          <w:p>
+            <w:r>
+              <w:rPr>
+                <w:sz w:val="18"/>
+              </w:rPr>
+              <w:t>엔지니어링 현장 관리 및 자재 수급 지원</w:t>
+            </w:r>
+          </w:p>
+        </w:tc>
+      </w:tr>
+      <w:tr>
+        <w:tc>
+          <w:tcPr>
+            <w:tcW w:type="dxa" w:w="2664"/>
+          </w:tcPr>
+          <w:p>
+            <w:pPr>
+              <w:jc w:val="center"/>
+            </w:pPr>
+            <w:r>
+              <w:rPr>
+                <w:sz w:val="18"/>
+              </w:rPr>
               <w:t>2015.11 ~ 2016.07</w:t>
             </w:r>
           </w:p>
@@ -621,7 +681,7 @@
               <w:rPr>
                 <w:sz w:val="18"/>
               </w:rPr>
-              <w:t>2009.12 ~ 2015.05</w:t>
+              <w:t>2002.01 ~ 2002.06</w:t>
             </w:r>
           </w:p>
         </w:tc>
@@ -634,7 +694,7 @@
               <w:rPr>
                 <w:sz w:val="18"/>
               </w:rPr>
-              <w:t>주식회사 케이엠기획</w:t>
+              <w:t>(주)희망백화점</w:t>
             </w:r>
           </w:p>
         </w:tc>
@@ -650,7 +710,7 @@
               <w:rPr>
                 <w:sz w:val="18"/>
               </w:rPr>
-              <w:t>차장 / 본부장</w:t>
+              <w:t>사원 / 디자이너</w:t>
             </w:r>
           </w:p>
         </w:tc>
@@ -663,67 +723,7 @@
               <w:rPr>
                 <w:sz w:val="18"/>
               </w:rPr>
-              <w:t>카자흐스탄 로또복권 해외주재원 6년, 악토베/친켄트 소장 및 남부본부장</w:t>
-            </w:r>
-          </w:p>
-        </w:tc>
-      </w:tr>
-      <w:tr>
-        <w:tc>
-          <w:tcPr>
-            <w:tcW w:type="dxa" w:w="2664"/>
-          </w:tcPr>
-          <w:p>
-            <w:pPr>
-              <w:jc w:val="center"/>
-            </w:pPr>
-            <w:r>
-              <w:rPr>
-                <w:sz w:val="18"/>
-              </w:rPr>
-              <w:t>2003.07 ~ 2008.04</w:t>
-            </w:r>
-          </w:p>
-        </w:tc>
-        <w:tc>
-          <w:tcPr>
-            <w:tcW w:type="dxa" w:w="2664"/>
-          </w:tcPr>
-          <w:p>
-            <w:r>
-              <w:rPr>
-                <w:sz w:val="18"/>
-              </w:rPr>
-              <w:t>주식회사 케이엠기획</w:t>
-            </w:r>
-          </w:p>
-        </w:tc>
-        <w:tc>
-          <w:tcPr>
-            <w:tcW w:type="dxa" w:w="2664"/>
-          </w:tcPr>
-          <w:p>
-            <w:pPr>
-              <w:jc w:val="center"/>
-            </w:pPr>
-            <w:r>
-              <w:rPr>
-                <w:sz w:val="18"/>
-              </w:rPr>
-              <w:t>대리</w:t>
-            </w:r>
-          </w:p>
-        </w:tc>
-        <w:tc>
-          <w:tcPr>
-            <w:tcW w:type="dxa" w:w="2664"/>
-          </w:tcPr>
-          <w:p>
-            <w:r>
-              <w:rPr>
-                <w:sz w:val="18"/>
-              </w:rPr>
-              <w:t>로또복권 1기 인천 가맹점 모집 (개인달성률 144%)</w:t>
+              <w:t>백화점 쇼핑몰 디자인 및 온라인 전산 관리</w:t>
             </w:r>
           </w:p>
         </w:tc>

</xml_diff>